<commit_message>
Update Bellabeat case study report
</commit_message>
<xml_diff>
--- a/report/Bellabeat_CaseStudy_Portfolio_Final.docx
+++ b/report/Bellabeat_CaseStudy_Portfolio_Final.docx
@@ -13,23 +13,13 @@
           <w:szCs w:val="28"/>
         </w:rPr>
       </w:pPr>
-      <w:proofErr w:type="spellStart"/>
       <w:r>
         <w:rPr>
           <w:rFonts w:ascii="Times New Roman" w:hAnsi="Times New Roman" w:cs="Times New Roman"/>
           <w:sz w:val="28"/>
           <w:szCs w:val="28"/>
         </w:rPr>
-        <w:t>Bellabeat</w:t>
-      </w:r>
-      <w:proofErr w:type="spellEnd"/>
-      <w:r>
-        <w:rPr>
-          <w:rFonts w:ascii="Times New Roman" w:hAnsi="Times New Roman" w:cs="Times New Roman"/>
-          <w:sz w:val="28"/>
-          <w:szCs w:val="28"/>
-        </w:rPr>
-        <w:t xml:space="preserve"> Smart-Device Usage Case Study</w:t>
+        <w:t>Bellabeat Smart-Device Usage Case Study</w:t>
       </w:r>
     </w:p>
     <w:p>
@@ -67,7 +57,7 @@
           <w:sz w:val="24"/>
           <w:szCs w:val="24"/>
         </w:rPr>
-        <w:t xml:space="preserve"> Junior Data Analyst </w:t>
+        <w:t xml:space="preserve"> Data Analyst </w:t>
       </w:r>
       <w:r>
         <w:rPr>
@@ -213,59 +203,13 @@
           <w:szCs w:val="24"/>
         </w:rPr>
       </w:pPr>
-      <w:proofErr w:type="spellStart"/>
       <w:r>
         <w:rPr>
           <w:rFonts w:ascii="Times New Roman" w:hAnsi="Times New Roman" w:cs="Times New Roman"/>
           <w:sz w:val="24"/>
           <w:szCs w:val="24"/>
         </w:rPr>
-        <w:t>Bellabeat</w:t>
-      </w:r>
-      <w:proofErr w:type="spellEnd"/>
-      <w:r>
-        <w:rPr>
-          <w:rFonts w:ascii="Times New Roman" w:hAnsi="Times New Roman" w:cs="Times New Roman"/>
-          <w:sz w:val="24"/>
-          <w:szCs w:val="24"/>
-        </w:rPr>
-        <w:t xml:space="preserve"> is a wellness technology company whose products are designed to support women's health and wellbeing. This project examines smart-device activity, sleep, </w:t>
-      </w:r>
-      <w:proofErr w:type="gramStart"/>
-      <w:r>
-        <w:rPr>
-          <w:rFonts w:ascii="Times New Roman" w:hAnsi="Times New Roman" w:cs="Times New Roman"/>
-          <w:sz w:val="24"/>
-          <w:szCs w:val="24"/>
-        </w:rPr>
-        <w:t>calorie</w:t>
-      </w:r>
-      <w:proofErr w:type="gramEnd"/>
-      <w:r>
-        <w:rPr>
-          <w:rFonts w:ascii="Times New Roman" w:hAnsi="Times New Roman" w:cs="Times New Roman"/>
-          <w:sz w:val="24"/>
-          <w:szCs w:val="24"/>
-        </w:rPr>
-        <w:t xml:space="preserve">, engagement, and time-of-day behavior to identify observable patterns that could inform </w:t>
-      </w:r>
-      <w:proofErr w:type="spellStart"/>
-      <w:r>
-        <w:rPr>
-          <w:rFonts w:ascii="Times New Roman" w:hAnsi="Times New Roman" w:cs="Times New Roman"/>
-          <w:sz w:val="24"/>
-          <w:szCs w:val="24"/>
-        </w:rPr>
-        <w:t>Bellabeat's</w:t>
-      </w:r>
-      <w:proofErr w:type="spellEnd"/>
-      <w:r>
-        <w:rPr>
-          <w:rFonts w:ascii="Times New Roman" w:hAnsi="Times New Roman" w:cs="Times New Roman"/>
-          <w:sz w:val="24"/>
-          <w:szCs w:val="24"/>
-        </w:rPr>
-        <w:t xml:space="preserve"> marketing and customer-engagement decisions.</w:t>
+        <w:t>Bellabeat is a wellness technology company whose products are designed to support women's health and wellbeing. This project examines smart-device activity, sleep, calorie, engagement, and time-of-day behavior to identify observable patterns that could inform Bellabeat's marketing and customer-engagement decisions.</w:t>
       </w:r>
     </w:p>
     <w:p>
@@ -283,43 +227,7 @@
           <w:sz w:val="24"/>
           <w:szCs w:val="24"/>
         </w:rPr>
-        <w:t xml:space="preserve">The dataset does not contain </w:t>
-      </w:r>
-      <w:proofErr w:type="spellStart"/>
-      <w:r>
-        <w:rPr>
-          <w:rFonts w:ascii="Times New Roman" w:hAnsi="Times New Roman" w:cs="Times New Roman"/>
-          <w:sz w:val="24"/>
-          <w:szCs w:val="24"/>
-        </w:rPr>
-        <w:t>Bellabeat</w:t>
-      </w:r>
-      <w:proofErr w:type="spellEnd"/>
-      <w:r>
-        <w:rPr>
-          <w:rFonts w:ascii="Times New Roman" w:hAnsi="Times New Roman" w:cs="Times New Roman"/>
-          <w:sz w:val="24"/>
-          <w:szCs w:val="24"/>
-        </w:rPr>
-        <w:t xml:space="preserve"> customer information, demographics, sales data, or campaign responses. Findings therefore describe the available smart-device sample and are not treated as direct evidence of </w:t>
-      </w:r>
-      <w:proofErr w:type="spellStart"/>
-      <w:r>
-        <w:rPr>
-          <w:rFonts w:ascii="Times New Roman" w:hAnsi="Times New Roman" w:cs="Times New Roman"/>
-          <w:sz w:val="24"/>
-          <w:szCs w:val="24"/>
-        </w:rPr>
-        <w:t>Bellabeat</w:t>
-      </w:r>
-      <w:proofErr w:type="spellEnd"/>
-      <w:r>
-        <w:rPr>
-          <w:rFonts w:ascii="Times New Roman" w:hAnsi="Times New Roman" w:cs="Times New Roman"/>
-          <w:sz w:val="24"/>
-          <w:szCs w:val="24"/>
-        </w:rPr>
-        <w:t xml:space="preserve"> customer behavior or business performance.</w:t>
+        <w:t>The dataset does not contain Bellabeat customer information, demographics, sales data, or campaign responses. Findings therefore describe the available smart-device sample and are not treated as direct evidence of Bellabeat customer behavior or business performance.</w:t>
       </w:r>
     </w:p>
     <w:p>
@@ -354,25 +262,7 @@
           <w:sz w:val="24"/>
           <w:szCs w:val="24"/>
         </w:rPr>
-        <w:t xml:space="preserve">To analyze smart-device usage patterns and identify evidence-based insights that could inform </w:t>
-      </w:r>
-      <w:proofErr w:type="spellStart"/>
-      <w:r>
-        <w:rPr>
-          <w:rFonts w:ascii="Times New Roman" w:hAnsi="Times New Roman" w:cs="Times New Roman"/>
-          <w:sz w:val="24"/>
-          <w:szCs w:val="24"/>
-        </w:rPr>
-        <w:t>Bellabeat's</w:t>
-      </w:r>
-      <w:proofErr w:type="spellEnd"/>
-      <w:r>
-        <w:rPr>
-          <w:rFonts w:ascii="Times New Roman" w:hAnsi="Times New Roman" w:cs="Times New Roman"/>
-          <w:sz w:val="24"/>
-          <w:szCs w:val="24"/>
-        </w:rPr>
-        <w:t xml:space="preserve"> marketing strategy and customer-engagement activities.</w:t>
+        <w:t>To analyze smart-device usage patterns and identify evidence-based insights that could inform Bellabeat's marketing strategy and customer-engagement activities.</w:t>
       </w:r>
     </w:p>
     <w:p>
@@ -464,25 +354,7 @@
           <w:sz w:val="24"/>
           <w:szCs w:val="24"/>
         </w:rPr>
-        <w:t xml:space="preserve">How could these trends apply to </w:t>
-      </w:r>
-      <w:proofErr w:type="spellStart"/>
-      <w:r>
-        <w:rPr>
-          <w:rFonts w:ascii="Times New Roman" w:hAnsi="Times New Roman" w:cs="Times New Roman"/>
-          <w:sz w:val="24"/>
-          <w:szCs w:val="24"/>
-        </w:rPr>
-        <w:t>Bellabeat</w:t>
-      </w:r>
-      <w:proofErr w:type="spellEnd"/>
-      <w:r>
-        <w:rPr>
-          <w:rFonts w:ascii="Times New Roman" w:hAnsi="Times New Roman" w:cs="Times New Roman"/>
-          <w:sz w:val="24"/>
-          <w:szCs w:val="24"/>
-        </w:rPr>
-        <w:t xml:space="preserve"> customers?</w:t>
+        <w:t>How could these trends apply to Bellabeat customers?</w:t>
       </w:r>
     </w:p>
     <w:p>
@@ -502,25 +374,7 @@
           <w:sz w:val="24"/>
           <w:szCs w:val="24"/>
         </w:rPr>
-        <w:t xml:space="preserve">How could these trends influence </w:t>
-      </w:r>
-      <w:proofErr w:type="spellStart"/>
-      <w:r>
-        <w:rPr>
-          <w:rFonts w:ascii="Times New Roman" w:hAnsi="Times New Roman" w:cs="Times New Roman"/>
-          <w:sz w:val="24"/>
-          <w:szCs w:val="24"/>
-        </w:rPr>
-        <w:t>Bellabeat's</w:t>
-      </w:r>
-      <w:proofErr w:type="spellEnd"/>
-      <w:r>
-        <w:rPr>
-          <w:rFonts w:ascii="Times New Roman" w:hAnsi="Times New Roman" w:cs="Times New Roman"/>
-          <w:sz w:val="24"/>
-          <w:szCs w:val="24"/>
-        </w:rPr>
-        <w:t xml:space="preserve"> marketing strategy?</w:t>
+        <w:t>How could these trends influence Bellabeat's marketing strategy?</w:t>
       </w:r>
     </w:p>
     <w:p>
@@ -1051,7 +905,6 @@
                 <w:szCs w:val="24"/>
               </w:rPr>
             </w:pPr>
-            <w:proofErr w:type="spellStart"/>
             <w:r>
               <w:rPr>
                 <w:rFonts w:ascii="Times New Roman" w:hAnsi="Times New Roman" w:cs="Times New Roman"/>
@@ -1060,7 +913,6 @@
               </w:rPr>
               <w:t>dailyActivity_merged</w:t>
             </w:r>
-            <w:proofErr w:type="spellEnd"/>
           </w:p>
         </w:tc>
         <w:tc>
@@ -1106,7 +958,6 @@
                 <w:szCs w:val="24"/>
               </w:rPr>
             </w:pPr>
-            <w:proofErr w:type="spellStart"/>
             <w:r>
               <w:rPr>
                 <w:rFonts w:ascii="Times New Roman" w:hAnsi="Times New Roman" w:cs="Times New Roman"/>
@@ -1115,7 +966,6 @@
               </w:rPr>
               <w:t>hourlySteps_merged</w:t>
             </w:r>
-            <w:proofErr w:type="spellEnd"/>
           </w:p>
         </w:tc>
         <w:tc>
@@ -1161,7 +1011,6 @@
                 <w:szCs w:val="24"/>
               </w:rPr>
             </w:pPr>
-            <w:proofErr w:type="spellStart"/>
             <w:r>
               <w:rPr>
                 <w:rFonts w:ascii="Times New Roman" w:hAnsi="Times New Roman" w:cs="Times New Roman"/>
@@ -1170,7 +1019,6 @@
               </w:rPr>
               <w:t>hourlyIntensities_merged</w:t>
             </w:r>
-            <w:proofErr w:type="spellEnd"/>
           </w:p>
         </w:tc>
         <w:tc>
@@ -1216,7 +1064,6 @@
                 <w:szCs w:val="24"/>
               </w:rPr>
             </w:pPr>
-            <w:proofErr w:type="spellStart"/>
             <w:r>
               <w:rPr>
                 <w:rFonts w:ascii="Times New Roman" w:hAnsi="Times New Roman" w:cs="Times New Roman"/>
@@ -1225,7 +1072,6 @@
               </w:rPr>
               <w:t>hourlyCalories_merged</w:t>
             </w:r>
-            <w:proofErr w:type="spellEnd"/>
           </w:p>
         </w:tc>
         <w:tc>
@@ -1271,7 +1117,6 @@
                 <w:szCs w:val="24"/>
               </w:rPr>
             </w:pPr>
-            <w:proofErr w:type="spellStart"/>
             <w:r>
               <w:rPr>
                 <w:rFonts w:ascii="Times New Roman" w:hAnsi="Times New Roman" w:cs="Times New Roman"/>
@@ -1280,7 +1125,6 @@
               </w:rPr>
               <w:t>sleepDay_merged</w:t>
             </w:r>
-            <w:proofErr w:type="spellEnd"/>
           </w:p>
         </w:tc>
         <w:tc>
@@ -1538,7 +1382,6 @@
                 <w:szCs w:val="24"/>
               </w:rPr>
             </w:pPr>
-            <w:proofErr w:type="spellStart"/>
             <w:r>
               <w:rPr>
                 <w:rFonts w:ascii="Times New Roman" w:hAnsi="Times New Roman" w:cs="Times New Roman"/>
@@ -1547,7 +1390,6 @@
               </w:rPr>
               <w:t>dailyActivity_merged</w:t>
             </w:r>
-            <w:proofErr w:type="spellEnd"/>
           </w:p>
         </w:tc>
         <w:tc>
@@ -1689,7 +1531,6 @@
                 <w:szCs w:val="24"/>
               </w:rPr>
             </w:pPr>
-            <w:proofErr w:type="spellStart"/>
             <w:r>
               <w:rPr>
                 <w:rFonts w:ascii="Times New Roman" w:hAnsi="Times New Roman" w:cs="Times New Roman"/>
@@ -1698,7 +1539,6 @@
               </w:rPr>
               <w:t>hourlySteps_merged</w:t>
             </w:r>
-            <w:proofErr w:type="spellEnd"/>
           </w:p>
         </w:tc>
         <w:tc>
@@ -1840,7 +1680,6 @@
                 <w:szCs w:val="24"/>
               </w:rPr>
             </w:pPr>
-            <w:proofErr w:type="spellStart"/>
             <w:r>
               <w:rPr>
                 <w:rFonts w:ascii="Times New Roman" w:hAnsi="Times New Roman" w:cs="Times New Roman"/>
@@ -1849,7 +1688,6 @@
               </w:rPr>
               <w:t>hourlyIntensities_merged</w:t>
             </w:r>
-            <w:proofErr w:type="spellEnd"/>
           </w:p>
         </w:tc>
         <w:tc>
@@ -1991,7 +1829,6 @@
                 <w:szCs w:val="24"/>
               </w:rPr>
             </w:pPr>
-            <w:proofErr w:type="spellStart"/>
             <w:r>
               <w:rPr>
                 <w:rFonts w:ascii="Times New Roman" w:hAnsi="Times New Roman" w:cs="Times New Roman"/>
@@ -2000,7 +1837,6 @@
               </w:rPr>
               <w:t>hourlyCalories_merged</w:t>
             </w:r>
-            <w:proofErr w:type="spellEnd"/>
           </w:p>
         </w:tc>
         <w:tc>
@@ -2142,7 +1978,6 @@
                 <w:szCs w:val="24"/>
               </w:rPr>
             </w:pPr>
-            <w:proofErr w:type="spellStart"/>
             <w:r>
               <w:rPr>
                 <w:rFonts w:ascii="Times New Roman" w:hAnsi="Times New Roman" w:cs="Times New Roman"/>
@@ -2151,7 +1986,6 @@
               </w:rPr>
               <w:t>sleepDay_merged</w:t>
             </w:r>
-            <w:proofErr w:type="spellEnd"/>
           </w:p>
         </w:tc>
         <w:tc>
@@ -2308,25 +2142,7 @@
           <w:sz w:val="24"/>
           <w:szCs w:val="24"/>
         </w:rPr>
-        <w:t xml:space="preserve">The selected data is structured and sufficiently comprehensive for exploratory activity, sleep, calorie, and device-use analysis. However, it is historical (2016), participant representativeness is limited, and it does not directly represent </w:t>
-      </w:r>
-      <w:proofErr w:type="spellStart"/>
-      <w:r>
-        <w:rPr>
-          <w:rFonts w:ascii="Times New Roman" w:hAnsi="Times New Roman" w:cs="Times New Roman"/>
-          <w:sz w:val="24"/>
-          <w:szCs w:val="24"/>
-        </w:rPr>
-        <w:t>Bellabeat</w:t>
-      </w:r>
-      <w:proofErr w:type="spellEnd"/>
-      <w:r>
-        <w:rPr>
-          <w:rFonts w:ascii="Times New Roman" w:hAnsi="Times New Roman" w:cs="Times New Roman"/>
-          <w:sz w:val="24"/>
-          <w:szCs w:val="24"/>
-        </w:rPr>
-        <w:t xml:space="preserve"> customers or contain marketing-response data. These constraints limit generalization and prevent causal or sales-performance claims.</w:t>
+        <w:t>The selected data is structured and sufficiently comprehensive for exploratory activity, sleep, calorie, and device-use analysis. However, it is historical (2016), participant representativeness is limited, and it does not directly represent Bellabeat customers or contain marketing-response data. These constraints limit generalization and prevent causal or sales-performance claims.</w:t>
       </w:r>
     </w:p>
     <w:p>
@@ -2477,25 +2293,7 @@
           <w:sz w:val="24"/>
           <w:szCs w:val="24"/>
         </w:rPr>
-        <w:t>The hourly steps, intensity, and calorie tables each contain 24,084 observations and were confirmed to align at the User ID–</w:t>
-      </w:r>
-      <w:proofErr w:type="spellStart"/>
-      <w:r>
-        <w:rPr>
-          <w:rFonts w:ascii="Times New Roman" w:hAnsi="Times New Roman" w:cs="Times New Roman"/>
-          <w:sz w:val="24"/>
-          <w:szCs w:val="24"/>
-        </w:rPr>
-        <w:t>ActivityHour</w:t>
-      </w:r>
-      <w:proofErr w:type="spellEnd"/>
-      <w:r>
-        <w:rPr>
-          <w:rFonts w:ascii="Times New Roman" w:hAnsi="Times New Roman" w:cs="Times New Roman"/>
-          <w:sz w:val="24"/>
-          <w:szCs w:val="24"/>
-        </w:rPr>
-        <w:t xml:space="preserve"> level. Their timestamps were standardized consistently.</w:t>
+        <w:t>The hourly steps, intensity, and calorie tables each contain 24,084 observations and were confirmed to align at the User ID–ActivityHour level. Their timestamps were standardized consistently.</w:t>
       </w:r>
     </w:p>
     <w:p>
@@ -2742,51 +2540,7 @@
           <w:szCs w:val="24"/>
           <w:lang w:val="en-NG"/>
         </w:rPr>
-        <w:t xml:space="preserve">Across 457 daily activity records, participants averaged approximately 6,547 steps per day, with a median of 5,946 steps. Activity-intensity patterns were dominated by sedentary and light activity: daily observations averaged 995.28 sedentary minutes and 170.07 lightly active minutes, compared with 16.62 very-active and 13.07 </w:t>
-      </w:r>
-      <w:proofErr w:type="gramStart"/>
-      <w:r>
-        <w:rPr>
-          <w:rFonts w:ascii="Times New Roman" w:hAnsi="Times New Roman" w:cs="Times New Roman"/>
-          <w:color w:val="000000" w:themeColor="text1"/>
-          <w:sz w:val="24"/>
-          <w:szCs w:val="24"/>
-          <w:lang w:val="en-NG"/>
-        </w:rPr>
-        <w:t>fairly-active</w:t>
-      </w:r>
-      <w:proofErr w:type="gramEnd"/>
-      <w:r>
-        <w:rPr>
-          <w:rFonts w:ascii="Times New Roman" w:hAnsi="Times New Roman" w:cs="Times New Roman"/>
-          <w:color w:val="000000" w:themeColor="text1"/>
-          <w:sz w:val="24"/>
-          <w:szCs w:val="24"/>
-          <w:lang w:val="en-NG"/>
-        </w:rPr>
-        <w:t xml:space="preserve"> minutes. More than half of daily records (52.74%) contained no very-active minutes, while 49.67% contained no </w:t>
-      </w:r>
-      <w:proofErr w:type="gramStart"/>
-      <w:r>
-        <w:rPr>
-          <w:rFonts w:ascii="Times New Roman" w:hAnsi="Times New Roman" w:cs="Times New Roman"/>
-          <w:color w:val="000000" w:themeColor="text1"/>
-          <w:sz w:val="24"/>
-          <w:szCs w:val="24"/>
-          <w:lang w:val="en-NG"/>
-        </w:rPr>
-        <w:t>fairly-active</w:t>
-      </w:r>
-      <w:proofErr w:type="gramEnd"/>
-      <w:r>
-        <w:rPr>
-          <w:rFonts w:ascii="Times New Roman" w:hAnsi="Times New Roman" w:cs="Times New Roman"/>
-          <w:color w:val="000000" w:themeColor="text1"/>
-          <w:sz w:val="24"/>
-          <w:szCs w:val="24"/>
-          <w:lang w:val="en-NG"/>
-        </w:rPr>
-        <w:t xml:space="preserve"> minutes. Overall, the available records indicate that participants spent substantially more recorded time sedentary or lightly active than engaged in moderate or higher-intensity activity.</w:t>
+        <w:t>Across 457 daily activity records, participants averaged approximately 6,547 steps per day, with a median of 5,946 steps. Activity-intensity patterns were dominated by sedentary and light activity: daily observations averaged 995.28 sedentary minutes and 170.07 lightly active minutes, compared with 16.62 very-active and 13.07 fairly-active minutes. More than half of daily records (52.74%) contained no very-active minutes, while 49.67% contained no fairly-active minutes. Overall, the available records indicate that participants spent substantially more recorded time sedentary or lightly active than engaged in moderate or higher-intensity activity.</w:t>
       </w:r>
     </w:p>
     <w:p>
@@ -2876,43 +2630,7 @@
           <w:sz w:val="24"/>
           <w:szCs w:val="24"/>
         </w:rPr>
-        <w:t xml:space="preserve"> Across 457 daily activity records, average recorded calorie expenditure was approximately 2,189 calories per day, with a median of 2,062. Total steps showed the strongest positive correlation with calories among the activity measures examined (r = 0.581), followed by very-active minutes (r = 0.519). </w:t>
-      </w:r>
-      <w:proofErr w:type="gramStart"/>
-      <w:r>
-        <w:rPr>
-          <w:rFonts w:ascii="Times New Roman" w:hAnsi="Times New Roman" w:cs="Times New Roman"/>
-          <w:sz w:val="24"/>
-          <w:szCs w:val="24"/>
-        </w:rPr>
-        <w:t>Lightly-active</w:t>
-      </w:r>
-      <w:proofErr w:type="gramEnd"/>
-      <w:r>
-        <w:rPr>
-          <w:rFonts w:ascii="Times New Roman" w:hAnsi="Times New Roman" w:cs="Times New Roman"/>
-          <w:sz w:val="24"/>
-          <w:szCs w:val="24"/>
-        </w:rPr>
-        <w:t xml:space="preserve"> minutes showed a weaker positive relationship (r = 0.377), while </w:t>
-      </w:r>
-      <w:proofErr w:type="gramStart"/>
-      <w:r>
-        <w:rPr>
-          <w:rFonts w:ascii="Times New Roman" w:hAnsi="Times New Roman" w:cs="Times New Roman"/>
-          <w:sz w:val="24"/>
-          <w:szCs w:val="24"/>
-        </w:rPr>
-        <w:t>fairly-active</w:t>
-      </w:r>
-      <w:proofErr w:type="gramEnd"/>
-      <w:r>
-        <w:rPr>
-          <w:rFonts w:ascii="Times New Roman" w:hAnsi="Times New Roman" w:cs="Times New Roman"/>
-          <w:sz w:val="24"/>
-          <w:szCs w:val="24"/>
-        </w:rPr>
-        <w:t xml:space="preserve"> minutes (r = −0.127) and sedentary minutes (r = 0.012) showed little linear association. A scatter plot of total steps and calories produced an R² of 0.338, supporting a moderate positive relationship between daily movement and recorded calorie expenditure. These relationships represent associations and should not be interpreted as evidence of causation.</w:t>
+        <w:t xml:space="preserve"> Across 457 daily activity records, average recorded calorie expenditure was approximately 2,189 calories per day, with a median of 2,062. Total steps showed the strongest positive correlation with calories among the activity measures examined (r = 0.581), followed by very-active minutes (r = 0.519). Lightly-active minutes showed a weaker positive relationship (r = 0.377), while fairly-active minutes (r = −0.127) and sedentary minutes (r = 0.012) showed little linear association. A scatter plot of total steps and calories produced an R² of 0.338, supporting a moderate positive relationship between daily movement and recorded calorie expenditure. These relationships represent associations and should not be interpreted as evidence of causation.</w:t>
       </w:r>
     </w:p>
     <w:p>
@@ -2962,51 +2680,7 @@
           <w:color w:val="000000" w:themeColor="text1"/>
           <w:szCs w:val="24"/>
         </w:rPr>
-        <w:t xml:space="preserve">Time-of-Day Behavior: Hourly activity analysis showed a clear time-of-day pattern. Recorded activity was lowest during the overnight and early-morning hours, reaching its minimum around 3 AM. Activity increased substantially from approximately 6 AM and remained relatively elevated throughout the daytime. Average steps reached a secondary peak around 12 PM (approximately 521 steps per hourly observation) </w:t>
-      </w:r>
-      <w:proofErr w:type="gramStart"/>
-      <w:r>
-        <w:rPr>
-          <w:rFonts w:ascii="Times New Roman" w:hAnsi="Times New Roman" w:cs="Times New Roman"/>
-          <w:b w:val="0"/>
-          <w:bCs w:val="0"/>
-          <w:color w:val="000000" w:themeColor="text1"/>
-          <w:szCs w:val="24"/>
-        </w:rPr>
-        <w:t>and</w:t>
-      </w:r>
-      <w:proofErr w:type="gramEnd"/>
-      <w:r>
-        <w:rPr>
-          <w:rFonts w:ascii="Times New Roman" w:hAnsi="Times New Roman" w:cs="Times New Roman"/>
-          <w:b w:val="0"/>
-          <w:bCs w:val="0"/>
-          <w:color w:val="000000" w:themeColor="text1"/>
-          <w:szCs w:val="24"/>
-        </w:rPr>
-        <w:t xml:space="preserve"> the highest level at 7 PM (approximately 529 steps). Total intensity and calorie expenditure also reached their highest hourly averages at 7 PM, indicating that early evening represented the strongest overall activity period in the available hourly records. Activity subsequently declined through the </w:t>
-      </w:r>
-      <w:proofErr w:type="gramStart"/>
-      <w:r>
-        <w:rPr>
-          <w:rFonts w:ascii="Times New Roman" w:hAnsi="Times New Roman" w:cs="Times New Roman"/>
-          <w:b w:val="0"/>
-          <w:bCs w:val="0"/>
-          <w:color w:val="000000" w:themeColor="text1"/>
-          <w:szCs w:val="24"/>
-        </w:rPr>
-        <w:t>later</w:t>
-      </w:r>
-      <w:proofErr w:type="gramEnd"/>
-      <w:r>
-        <w:rPr>
-          <w:rFonts w:ascii="Times New Roman" w:hAnsi="Times New Roman" w:cs="Times New Roman"/>
-          <w:b w:val="0"/>
-          <w:bCs w:val="0"/>
-          <w:color w:val="000000" w:themeColor="text1"/>
-          <w:szCs w:val="24"/>
-        </w:rPr>
-        <w:t xml:space="preserve"> evening hours.</w:t>
+        <w:t>Time-of-Day Behavior: Hourly activity analysis showed a clear time-of-day pattern. Recorded activity was lowest during the overnight and early-morning hours, reaching its minimum around 3 AM. Activity increased substantially from approximately 6 AM and remained relatively elevated throughout the daytime. Average steps reached a secondary peak around 12 PM (approximately 521 steps per hourly observation) and the highest level at 7 PM (approximately 529 steps). Total intensity and calorie expenditure also reached their highest hourly averages at 7 PM, indicating that early evening represented the strongest overall activity period in the available hourly records. Activity subsequently declined through the later evening hours.</w:t>
       </w:r>
     </w:p>
     <w:p/>
@@ -3055,20 +2729,8 @@
           <w:szCs w:val="24"/>
           <w:lang w:val="en-NG"/>
         </w:rPr>
-        <w:t xml:space="preserve">The findings from the five supporting analytical areas—device usage and engagement, physical activity, sleep, calories, and time-of-day </w:t>
+        <w:t>The findings from the five supporting analytical areas—device usage and engagement, physical activity, sleep, calories, and time-of-day behavior</w:t>
       </w:r>
-      <w:proofErr w:type="spellStart"/>
-      <w:r>
-        <w:rPr>
-          <w:rFonts w:ascii="Times New Roman" w:eastAsiaTheme="majorEastAsia" w:hAnsi="Times New Roman" w:cs="Times New Roman"/>
-          <w:color w:val="000000" w:themeColor="text1"/>
-          <w:sz w:val="24"/>
-          <w:szCs w:val="24"/>
-          <w:lang w:val="en-NG"/>
-        </w:rPr>
-        <w:t>behavior</w:t>
-      </w:r>
-      <w:proofErr w:type="spellEnd"/>
       <w:r>
         <w:rPr>
           <w:rFonts w:ascii="Times New Roman" w:eastAsiaTheme="majorEastAsia" w:hAnsi="Times New Roman" w:cs="Times New Roman"/>
@@ -3087,29 +2749,7 @@
           <w:szCs w:val="24"/>
           <w:lang w:val="en-NG"/>
         </w:rPr>
-        <w:t xml:space="preserve">were synthesized to directly address </w:t>
-      </w:r>
-      <w:proofErr w:type="spellStart"/>
-      <w:r>
-        <w:rPr>
-          <w:rFonts w:ascii="Times New Roman" w:eastAsiaTheme="majorEastAsia" w:hAnsi="Times New Roman" w:cs="Times New Roman"/>
-          <w:color w:val="000000" w:themeColor="text1"/>
-          <w:sz w:val="24"/>
-          <w:szCs w:val="24"/>
-          <w:lang w:val="en-NG"/>
-        </w:rPr>
-        <w:t>Bellabeat's</w:t>
-      </w:r>
-      <w:proofErr w:type="spellEnd"/>
-      <w:r>
-        <w:rPr>
-          <w:rFonts w:ascii="Times New Roman" w:eastAsiaTheme="majorEastAsia" w:hAnsi="Times New Roman" w:cs="Times New Roman"/>
-          <w:color w:val="000000" w:themeColor="text1"/>
-          <w:sz w:val="24"/>
-          <w:szCs w:val="24"/>
-          <w:lang w:val="en-NG"/>
-        </w:rPr>
-        <w:t xml:space="preserve"> three original business questions.</w:t>
+        <w:t>were synthesized to directly address Bellabeat's three original business questions.</w:t>
       </w:r>
     </w:p>
     <w:p>
@@ -3154,29 +2794,7 @@
           <w:lang w:val="en-NG"/>
         </w:rPr>
         <w:lastRenderedPageBreak/>
-        <w:t xml:space="preserve">The analysis identified several notable patterns in the available smart-device data. Recorded daily </w:t>
-      </w:r>
-      <w:proofErr w:type="spellStart"/>
-      <w:r>
-        <w:rPr>
-          <w:rFonts w:ascii="Times New Roman" w:eastAsiaTheme="majorEastAsia" w:hAnsi="Times New Roman" w:cs="Times New Roman"/>
-          <w:color w:val="000000" w:themeColor="text1"/>
-          <w:sz w:val="24"/>
-          <w:szCs w:val="24"/>
-          <w:lang w:val="en-NG"/>
-        </w:rPr>
-        <w:t>behavior</w:t>
-      </w:r>
-      <w:proofErr w:type="spellEnd"/>
-      <w:r>
-        <w:rPr>
-          <w:rFonts w:ascii="Times New Roman" w:eastAsiaTheme="majorEastAsia" w:hAnsi="Times New Roman" w:cs="Times New Roman"/>
-          <w:color w:val="000000" w:themeColor="text1"/>
-          <w:sz w:val="24"/>
-          <w:szCs w:val="24"/>
-          <w:lang w:val="en-NG"/>
-        </w:rPr>
-        <w:t xml:space="preserve"> was dominated by sedentary and light activity, while moderate and higher-intensity activity occurred less consistently. Participants averaged approximately 6,547 steps per daily observation, while sleep records showed an average of approximately seven hours of sleep per recorded night, although sleep duration varied considerably.</w:t>
+        <w:t>The analysis identified several notable patterns in the available smart-device data. Recorded daily behavior was dominated by sedentary and light activity, while moderate and higher-intensity activity occurred less consistently. Participants averaged approximately 6,547 steps per daily observation, while sleep records showed an average of approximately seven hours of sleep per recorded night, although sleep duration varied considerably.</w:t>
       </w:r>
     </w:p>
     <w:p>
@@ -3242,29 +2860,7 @@
           <w:szCs w:val="24"/>
           <w:lang w:val="en-NG"/>
         </w:rPr>
-        <w:t xml:space="preserve">Overall, the available data suggests that smart-device </w:t>
-      </w:r>
-      <w:proofErr w:type="spellStart"/>
-      <w:r>
-        <w:rPr>
-          <w:rFonts w:ascii="Times New Roman" w:eastAsiaTheme="majorEastAsia" w:hAnsi="Times New Roman" w:cs="Times New Roman"/>
-          <w:color w:val="000000" w:themeColor="text1"/>
-          <w:sz w:val="24"/>
-          <w:szCs w:val="24"/>
-          <w:lang w:val="en-NG"/>
-        </w:rPr>
-        <w:t>behavior</w:t>
-      </w:r>
-      <w:proofErr w:type="spellEnd"/>
-      <w:r>
-        <w:rPr>
-          <w:rFonts w:ascii="Times New Roman" w:eastAsiaTheme="majorEastAsia" w:hAnsi="Times New Roman" w:cs="Times New Roman"/>
-          <w:color w:val="000000" w:themeColor="text1"/>
-          <w:sz w:val="24"/>
-          <w:szCs w:val="24"/>
-          <w:lang w:val="en-NG"/>
-        </w:rPr>
-        <w:t xml:space="preserve"> was characterized by predominantly sedentary and light activity, variable sleep patterns, a positive association between movement and calorie expenditure, distinct time-of-day activity patterns, and uneven recording coverage.</w:t>
+        <w:t>Overall, the available data suggests that smart-device behavior was characterized by predominantly sedentary and light activity, variable sleep patterns, a positive association between movement and calorie expenditure, distinct time-of-day activity patterns, and uneven recording coverage.</w:t>
       </w:r>
     </w:p>
     <w:p>
@@ -3286,29 +2882,7 @@
           <w:szCs w:val="24"/>
           <w:lang w:val="en-NG"/>
         </w:rPr>
-        <w:t xml:space="preserve">7.2 Application to </w:t>
-      </w:r>
-      <w:proofErr w:type="spellStart"/>
-      <w:r>
-        <w:rPr>
-          <w:rFonts w:ascii="Times New Roman" w:eastAsiaTheme="majorEastAsia" w:hAnsi="Times New Roman" w:cs="Times New Roman"/>
-          <w:color w:val="1F497D" w:themeColor="text2"/>
-          <w:sz w:val="24"/>
-          <w:szCs w:val="24"/>
-          <w:lang w:val="en-NG"/>
-        </w:rPr>
-        <w:t>Bellabeat</w:t>
-      </w:r>
-      <w:proofErr w:type="spellEnd"/>
-      <w:r>
-        <w:rPr>
-          <w:rFonts w:ascii="Times New Roman" w:eastAsiaTheme="majorEastAsia" w:hAnsi="Times New Roman" w:cs="Times New Roman"/>
-          <w:color w:val="1F497D" w:themeColor="text2"/>
-          <w:sz w:val="24"/>
-          <w:szCs w:val="24"/>
-          <w:lang w:val="en-NG"/>
-        </w:rPr>
-        <w:t xml:space="preserve"> Customers</w:t>
+        <w:t>7.2 Application to Bellabeat Customers</w:t>
       </w:r>
     </w:p>
     <w:p>
@@ -3330,73 +2904,7 @@
           <w:szCs w:val="24"/>
           <w:lang w:val="en-NG"/>
         </w:rPr>
-        <w:t xml:space="preserve">Although the dataset does not contain </w:t>
-      </w:r>
-      <w:proofErr w:type="spellStart"/>
-      <w:r>
-        <w:rPr>
-          <w:rFonts w:ascii="Times New Roman" w:eastAsiaTheme="majorEastAsia" w:hAnsi="Times New Roman" w:cs="Times New Roman"/>
-          <w:color w:val="000000" w:themeColor="text1"/>
-          <w:sz w:val="24"/>
-          <w:szCs w:val="24"/>
-          <w:lang w:val="en-NG"/>
-        </w:rPr>
-        <w:t>Bellabeat</w:t>
-      </w:r>
-      <w:proofErr w:type="spellEnd"/>
-      <w:r>
-        <w:rPr>
-          <w:rFonts w:ascii="Times New Roman" w:eastAsiaTheme="majorEastAsia" w:hAnsi="Times New Roman" w:cs="Times New Roman"/>
-          <w:color w:val="000000" w:themeColor="text1"/>
-          <w:sz w:val="24"/>
-          <w:szCs w:val="24"/>
-          <w:lang w:val="en-NG"/>
-        </w:rPr>
-        <w:t xml:space="preserve"> customers, the observed patterns provide exploratory indications of </w:t>
-      </w:r>
-      <w:proofErr w:type="spellStart"/>
-      <w:r>
-        <w:rPr>
-          <w:rFonts w:ascii="Times New Roman" w:eastAsiaTheme="majorEastAsia" w:hAnsi="Times New Roman" w:cs="Times New Roman"/>
-          <w:color w:val="000000" w:themeColor="text1"/>
-          <w:sz w:val="24"/>
-          <w:szCs w:val="24"/>
-          <w:lang w:val="en-NG"/>
-        </w:rPr>
-        <w:t>behaviors</w:t>
-      </w:r>
-      <w:proofErr w:type="spellEnd"/>
-      <w:r>
-        <w:rPr>
-          <w:rFonts w:ascii="Times New Roman" w:eastAsiaTheme="majorEastAsia" w:hAnsi="Times New Roman" w:cs="Times New Roman"/>
-          <w:color w:val="000000" w:themeColor="text1"/>
-          <w:sz w:val="24"/>
-          <w:szCs w:val="24"/>
-          <w:lang w:val="en-NG"/>
-        </w:rPr>
-        <w:t xml:space="preserve"> that may be relevant to </w:t>
-      </w:r>
-      <w:proofErr w:type="spellStart"/>
-      <w:r>
-        <w:rPr>
-          <w:rFonts w:ascii="Times New Roman" w:eastAsiaTheme="majorEastAsia" w:hAnsi="Times New Roman" w:cs="Times New Roman"/>
-          <w:color w:val="000000" w:themeColor="text1"/>
-          <w:sz w:val="24"/>
-          <w:szCs w:val="24"/>
-          <w:lang w:val="en-NG"/>
-        </w:rPr>
-        <w:t>Bellabeat's</w:t>
-      </w:r>
-      <w:proofErr w:type="spellEnd"/>
-      <w:r>
-        <w:rPr>
-          <w:rFonts w:ascii="Times New Roman" w:eastAsiaTheme="majorEastAsia" w:hAnsi="Times New Roman" w:cs="Times New Roman"/>
-          <w:color w:val="000000" w:themeColor="text1"/>
-          <w:sz w:val="24"/>
-          <w:szCs w:val="24"/>
-          <w:lang w:val="en-NG"/>
-        </w:rPr>
-        <w:t xml:space="preserve"> audience.</w:t>
+        <w:t>Although the dataset does not contain Bellabeat customers, the observed patterns provide exploratory indications of behaviors that may be relevant to Bellabeat's audience.</w:t>
       </w:r>
     </w:p>
     <w:p>
@@ -3418,51 +2926,7 @@
           <w:szCs w:val="24"/>
           <w:lang w:val="en-NG"/>
         </w:rPr>
-        <w:t xml:space="preserve">The prevalence of sedentary and light activity suggests an opportunity for </w:t>
-      </w:r>
-      <w:proofErr w:type="spellStart"/>
-      <w:r>
-        <w:rPr>
-          <w:rFonts w:ascii="Times New Roman" w:eastAsiaTheme="majorEastAsia" w:hAnsi="Times New Roman" w:cs="Times New Roman"/>
-          <w:color w:val="000000" w:themeColor="text1"/>
-          <w:sz w:val="24"/>
-          <w:szCs w:val="24"/>
-          <w:lang w:val="en-NG"/>
-        </w:rPr>
-        <w:t>Bellabeat</w:t>
-      </w:r>
-      <w:proofErr w:type="spellEnd"/>
-      <w:r>
-        <w:rPr>
-          <w:rFonts w:ascii="Times New Roman" w:eastAsiaTheme="majorEastAsia" w:hAnsi="Times New Roman" w:cs="Times New Roman"/>
-          <w:color w:val="000000" w:themeColor="text1"/>
-          <w:sz w:val="24"/>
-          <w:szCs w:val="24"/>
-          <w:lang w:val="en-NG"/>
-        </w:rPr>
-        <w:t xml:space="preserve"> to support users in incorporating manageable movement into everyday routines, rather than focusing exclusively on intensive exercise. Variation in recorded sleep </w:t>
-      </w:r>
-      <w:proofErr w:type="spellStart"/>
-      <w:r>
-        <w:rPr>
-          <w:rFonts w:ascii="Times New Roman" w:eastAsiaTheme="majorEastAsia" w:hAnsi="Times New Roman" w:cs="Times New Roman"/>
-          <w:color w:val="000000" w:themeColor="text1"/>
-          <w:sz w:val="24"/>
-          <w:szCs w:val="24"/>
-          <w:lang w:val="en-NG"/>
-        </w:rPr>
-        <w:t>behavior</w:t>
-      </w:r>
-      <w:proofErr w:type="spellEnd"/>
-      <w:r>
-        <w:rPr>
-          <w:rFonts w:ascii="Times New Roman" w:eastAsiaTheme="majorEastAsia" w:hAnsi="Times New Roman" w:cs="Times New Roman"/>
-          <w:color w:val="000000" w:themeColor="text1"/>
-          <w:sz w:val="24"/>
-          <w:szCs w:val="24"/>
-          <w:lang w:val="en-NG"/>
-        </w:rPr>
-        <w:t xml:space="preserve"> also reinforces the potential value of helping users understand their individual sleep patterns and wellness trends.</w:t>
+        <w:t>The prevalence of sedentary and light activity suggests an opportunity for Bellabeat to support users in incorporating manageable movement into everyday routines, rather than focusing exclusively on intensive exercise. Variation in recorded sleep behavior also reinforces the potential value of helping users understand their individual sleep patterns and wellness trends.</w:t>
       </w:r>
     </w:p>
     <w:p>
@@ -3484,29 +2948,7 @@
           <w:szCs w:val="24"/>
           <w:lang w:val="en-NG"/>
         </w:rPr>
-        <w:t xml:space="preserve">Differences in activity throughout the day suggest that the timing of reminders, activity prompts, and other engagement features could potentially be personalized according to user </w:t>
-      </w:r>
-      <w:proofErr w:type="spellStart"/>
-      <w:r>
-        <w:rPr>
-          <w:rFonts w:ascii="Times New Roman" w:eastAsiaTheme="majorEastAsia" w:hAnsi="Times New Roman" w:cs="Times New Roman"/>
-          <w:color w:val="000000" w:themeColor="text1"/>
-          <w:sz w:val="24"/>
-          <w:szCs w:val="24"/>
-          <w:lang w:val="en-NG"/>
-        </w:rPr>
-        <w:t>behavior</w:t>
-      </w:r>
-      <w:proofErr w:type="spellEnd"/>
-      <w:r>
-        <w:rPr>
-          <w:rFonts w:ascii="Times New Roman" w:eastAsiaTheme="majorEastAsia" w:hAnsi="Times New Roman" w:cs="Times New Roman"/>
-          <w:color w:val="000000" w:themeColor="text1"/>
-          <w:sz w:val="24"/>
-          <w:szCs w:val="24"/>
-          <w:lang w:val="en-NG"/>
-        </w:rPr>
-        <w:t>. In addition, variation in recorded activity coverage highlights the potential importance of encouraging consistent tracking so users can build more complete personal wellness histories.</w:t>
+        <w:t>Differences in activity throughout the day suggest that the timing of reminders, activity prompts, and other engagement features could potentially be personalized according to user behavior. In addition, variation in recorded activity coverage highlights the potential importance of encouraging consistent tracking so users can build more complete personal wellness histories.</w:t>
       </w:r>
     </w:p>
     <w:p>
@@ -3528,73 +2970,7 @@
           <w:szCs w:val="24"/>
           <w:lang w:val="en-NG"/>
         </w:rPr>
-        <w:t xml:space="preserve">These applications should be treated as hypotheses rather than established </w:t>
-      </w:r>
-      <w:proofErr w:type="spellStart"/>
-      <w:r>
-        <w:rPr>
-          <w:rFonts w:ascii="Times New Roman" w:eastAsiaTheme="majorEastAsia" w:hAnsi="Times New Roman" w:cs="Times New Roman"/>
-          <w:color w:val="000000" w:themeColor="text1"/>
-          <w:sz w:val="24"/>
-          <w:szCs w:val="24"/>
-          <w:lang w:val="en-NG"/>
-        </w:rPr>
-        <w:t>Bellabeat</w:t>
-      </w:r>
-      <w:proofErr w:type="spellEnd"/>
-      <w:r>
-        <w:rPr>
-          <w:rFonts w:ascii="Times New Roman" w:eastAsiaTheme="majorEastAsia" w:hAnsi="Times New Roman" w:cs="Times New Roman"/>
-          <w:color w:val="000000" w:themeColor="text1"/>
-          <w:sz w:val="24"/>
-          <w:szCs w:val="24"/>
-          <w:lang w:val="en-NG"/>
-        </w:rPr>
-        <w:t xml:space="preserve"> customer </w:t>
-      </w:r>
-      <w:proofErr w:type="spellStart"/>
-      <w:r>
-        <w:rPr>
-          <w:rFonts w:ascii="Times New Roman" w:eastAsiaTheme="majorEastAsia" w:hAnsi="Times New Roman" w:cs="Times New Roman"/>
-          <w:color w:val="000000" w:themeColor="text1"/>
-          <w:sz w:val="24"/>
-          <w:szCs w:val="24"/>
-          <w:lang w:val="en-NG"/>
-        </w:rPr>
-        <w:t>behavior</w:t>
-      </w:r>
-      <w:proofErr w:type="spellEnd"/>
-      <w:r>
-        <w:rPr>
-          <w:rFonts w:ascii="Times New Roman" w:eastAsiaTheme="majorEastAsia" w:hAnsi="Times New Roman" w:cs="Times New Roman"/>
-          <w:color w:val="000000" w:themeColor="text1"/>
-          <w:sz w:val="24"/>
-          <w:szCs w:val="24"/>
-          <w:lang w:val="en-NG"/>
-        </w:rPr>
-        <w:t xml:space="preserve"> and should be validated using </w:t>
-      </w:r>
-      <w:proofErr w:type="spellStart"/>
-      <w:r>
-        <w:rPr>
-          <w:rFonts w:ascii="Times New Roman" w:eastAsiaTheme="majorEastAsia" w:hAnsi="Times New Roman" w:cs="Times New Roman"/>
-          <w:color w:val="000000" w:themeColor="text1"/>
-          <w:sz w:val="24"/>
-          <w:szCs w:val="24"/>
-          <w:lang w:val="en-NG"/>
-        </w:rPr>
-        <w:t>Bellabeat</w:t>
-      </w:r>
-      <w:proofErr w:type="spellEnd"/>
-      <w:r>
-        <w:rPr>
-          <w:rFonts w:ascii="Times New Roman" w:eastAsiaTheme="majorEastAsia" w:hAnsi="Times New Roman" w:cs="Times New Roman"/>
-          <w:color w:val="000000" w:themeColor="text1"/>
-          <w:sz w:val="24"/>
-          <w:szCs w:val="24"/>
-          <w:lang w:val="en-NG"/>
-        </w:rPr>
-        <w:t>-specific customer data.</w:t>
+        <w:t>These applications should be treated as hypotheses rather than established Bellabeat customer behavior and should be validated using Bellabeat-specific customer data.</w:t>
       </w:r>
     </w:p>
     <w:p>
@@ -3638,29 +3014,7 @@
           <w:szCs w:val="24"/>
           <w:lang w:val="en-NG"/>
         </w:rPr>
-        <w:t xml:space="preserve">The identified trends suggest several directions that </w:t>
-      </w:r>
-      <w:proofErr w:type="spellStart"/>
-      <w:r>
-        <w:rPr>
-          <w:rFonts w:ascii="Times New Roman" w:eastAsiaTheme="majorEastAsia" w:hAnsi="Times New Roman" w:cs="Times New Roman"/>
-          <w:color w:val="000000" w:themeColor="text1"/>
-          <w:sz w:val="24"/>
-          <w:szCs w:val="24"/>
-          <w:lang w:val="en-NG"/>
-        </w:rPr>
-        <w:t>Bellabeat</w:t>
-      </w:r>
-      <w:proofErr w:type="spellEnd"/>
-      <w:r>
-        <w:rPr>
-          <w:rFonts w:ascii="Times New Roman" w:eastAsiaTheme="majorEastAsia" w:hAnsi="Times New Roman" w:cs="Times New Roman"/>
-          <w:color w:val="000000" w:themeColor="text1"/>
-          <w:sz w:val="24"/>
-          <w:szCs w:val="24"/>
-          <w:lang w:val="en-NG"/>
-        </w:rPr>
-        <w:t xml:space="preserve"> could explore in its marketing strategy. Messaging could emphasize achievable everyday movement, consistent wellness tracking, and personalized understanding of activity and sleep patterns, positioning wellness as something that can be incorporated into everyday routines rather than focusing primarily on intensive exercise.</w:t>
+        <w:t>The identified trends suggest several directions that Bellabeat could explore in its marketing strategy. Messaging could emphasize achievable everyday movement, consistent wellness tracking, and personalized understanding of activity and sleep patterns, positioning wellness as something that can be incorporated into everyday routines rather than focusing primarily on intensive exercise.</w:t>
       </w:r>
     </w:p>
     <w:p>
@@ -3674,7 +3028,6 @@
           <w:lang w:val="en-NG"/>
         </w:rPr>
       </w:pPr>
-      <w:proofErr w:type="spellStart"/>
       <w:r>
         <w:rPr>
           <w:rFonts w:ascii="Times New Roman" w:eastAsiaTheme="majorEastAsia" w:hAnsi="Times New Roman" w:cs="Times New Roman"/>
@@ -3683,40 +3036,7 @@
           <w:szCs w:val="24"/>
           <w:lang w:val="en-NG"/>
         </w:rPr>
-        <w:t>Bellabeat</w:t>
-      </w:r>
-      <w:proofErr w:type="spellEnd"/>
-      <w:r>
-        <w:rPr>
-          <w:rFonts w:ascii="Times New Roman" w:eastAsiaTheme="majorEastAsia" w:hAnsi="Times New Roman" w:cs="Times New Roman"/>
-          <w:color w:val="000000" w:themeColor="text1"/>
-          <w:sz w:val="24"/>
-          <w:szCs w:val="24"/>
-          <w:lang w:val="en-NG"/>
-        </w:rPr>
-        <w:t xml:space="preserve"> could also explore marketing that demonstrates how different tracked metrics—such as movement, sleep, and calorie expenditure—can provide users with a more connected understanding of their wellness </w:t>
-      </w:r>
-      <w:proofErr w:type="spellStart"/>
-      <w:r>
-        <w:rPr>
-          <w:rFonts w:ascii="Times New Roman" w:eastAsiaTheme="majorEastAsia" w:hAnsi="Times New Roman" w:cs="Times New Roman"/>
-          <w:color w:val="000000" w:themeColor="text1"/>
-          <w:sz w:val="24"/>
-          <w:szCs w:val="24"/>
-          <w:lang w:val="en-NG"/>
-        </w:rPr>
-        <w:t>behavior</w:t>
-      </w:r>
-      <w:proofErr w:type="spellEnd"/>
-      <w:r>
-        <w:rPr>
-          <w:rFonts w:ascii="Times New Roman" w:eastAsiaTheme="majorEastAsia" w:hAnsi="Times New Roman" w:cs="Times New Roman"/>
-          <w:color w:val="000000" w:themeColor="text1"/>
-          <w:sz w:val="24"/>
-          <w:szCs w:val="24"/>
-          <w:lang w:val="en-NG"/>
-        </w:rPr>
-        <w:t>.</w:t>
+        <w:t>Bellabeat could also explore marketing that demonstrates how different tracked metrics—such as movement, sleep, and calorie expenditure—can provide users with a more connected understanding of their wellness behavior.</w:t>
       </w:r>
     </w:p>
     <w:p>
@@ -3738,51 +3058,7 @@
           <w:szCs w:val="24"/>
           <w:lang w:val="en-NG"/>
         </w:rPr>
-        <w:t xml:space="preserve">The observed time-of-day pattern could further inform testing of appropriately timed engagement campaigns, reminders, or wellness prompts. However, the 7 PM activity peak should not be interpreted as proof that 7 PM is the optimal communication time; instead, it provides a </w:t>
-      </w:r>
-      <w:proofErr w:type="spellStart"/>
-      <w:r>
-        <w:rPr>
-          <w:rFonts w:ascii="Times New Roman" w:eastAsiaTheme="majorEastAsia" w:hAnsi="Times New Roman" w:cs="Times New Roman"/>
-          <w:color w:val="000000" w:themeColor="text1"/>
-          <w:sz w:val="24"/>
-          <w:szCs w:val="24"/>
-          <w:lang w:val="en-NG"/>
-        </w:rPr>
-        <w:t>behavioral</w:t>
-      </w:r>
-      <w:proofErr w:type="spellEnd"/>
-      <w:r>
-        <w:rPr>
-          <w:rFonts w:ascii="Times New Roman" w:eastAsiaTheme="majorEastAsia" w:hAnsi="Times New Roman" w:cs="Times New Roman"/>
-          <w:color w:val="000000" w:themeColor="text1"/>
-          <w:sz w:val="24"/>
-          <w:szCs w:val="24"/>
-          <w:lang w:val="en-NG"/>
-        </w:rPr>
-        <w:t xml:space="preserve"> hypothesis that could be tested using </w:t>
-      </w:r>
-      <w:proofErr w:type="spellStart"/>
-      <w:r>
-        <w:rPr>
-          <w:rFonts w:ascii="Times New Roman" w:eastAsiaTheme="majorEastAsia" w:hAnsi="Times New Roman" w:cs="Times New Roman"/>
-          <w:color w:val="000000" w:themeColor="text1"/>
-          <w:sz w:val="24"/>
-          <w:szCs w:val="24"/>
-          <w:lang w:val="en-NG"/>
-        </w:rPr>
-        <w:t>Bellabeat's</w:t>
-      </w:r>
-      <w:proofErr w:type="spellEnd"/>
-      <w:r>
-        <w:rPr>
-          <w:rFonts w:ascii="Times New Roman" w:eastAsiaTheme="majorEastAsia" w:hAnsi="Times New Roman" w:cs="Times New Roman"/>
-          <w:color w:val="000000" w:themeColor="text1"/>
-          <w:sz w:val="24"/>
-          <w:szCs w:val="24"/>
-          <w:lang w:val="en-NG"/>
-        </w:rPr>
-        <w:t xml:space="preserve"> own engagement data.</w:t>
+        <w:t>The observed time-of-day pattern could further inform testing of appropriately timed engagement campaigns, reminders, or wellness prompts. However, the 7 PM activity peak should not be interpreted as proof that 7 PM is the optimal communication time; instead, it provides a behavioral hypothesis that could be tested using Bellabeat's own engagement data.</w:t>
       </w:r>
     </w:p>
     <w:p>
@@ -3804,9 +3080,8 @@
           <w:szCs w:val="24"/>
           <w:lang w:val="en-NG"/>
         </w:rPr>
-        <w:t xml:space="preserve">Overall, these findings support a marketing direction </w:t>
+        <w:t xml:space="preserve">Overall, these findings support a marketing direction centered on accessible daily wellness, personalization, consistent tracking, and behavior-informed engagement. Because the analyzed data </w:t>
       </w:r>
-      <w:proofErr w:type="spellStart"/>
       <w:r>
         <w:rPr>
           <w:rFonts w:ascii="Times New Roman" w:eastAsiaTheme="majorEastAsia" w:hAnsi="Times New Roman" w:cs="Times New Roman"/>
@@ -3815,117 +3090,8 @@
           <w:szCs w:val="24"/>
           <w:lang w:val="en-NG"/>
         </w:rPr>
-        <w:t>centered</w:t>
-      </w:r>
-      <w:proofErr w:type="spellEnd"/>
-      <w:r>
-        <w:rPr>
-          <w:rFonts w:ascii="Times New Roman" w:eastAsiaTheme="majorEastAsia" w:hAnsi="Times New Roman" w:cs="Times New Roman"/>
-          <w:color w:val="000000" w:themeColor="text1"/>
-          <w:sz w:val="24"/>
-          <w:szCs w:val="24"/>
-          <w:lang w:val="en-NG"/>
-        </w:rPr>
-        <w:t xml:space="preserve"> on accessible daily wellness, personalization, consistent tracking, and </w:t>
-      </w:r>
-      <w:proofErr w:type="spellStart"/>
-      <w:r>
-        <w:rPr>
-          <w:rFonts w:ascii="Times New Roman" w:eastAsiaTheme="majorEastAsia" w:hAnsi="Times New Roman" w:cs="Times New Roman"/>
-          <w:color w:val="000000" w:themeColor="text1"/>
-          <w:sz w:val="24"/>
-          <w:szCs w:val="24"/>
-          <w:lang w:val="en-NG"/>
-        </w:rPr>
-        <w:t>behavior</w:t>
-      </w:r>
-      <w:proofErr w:type="spellEnd"/>
-      <w:r>
-        <w:rPr>
-          <w:rFonts w:ascii="Times New Roman" w:eastAsiaTheme="majorEastAsia" w:hAnsi="Times New Roman" w:cs="Times New Roman"/>
-          <w:color w:val="000000" w:themeColor="text1"/>
-          <w:sz w:val="24"/>
-          <w:szCs w:val="24"/>
-          <w:lang w:val="en-NG"/>
-        </w:rPr>
-        <w:t xml:space="preserve">-informed engagement. Because the </w:t>
-      </w:r>
-      <w:proofErr w:type="spellStart"/>
-      <w:r>
-        <w:rPr>
-          <w:rFonts w:ascii="Times New Roman" w:eastAsiaTheme="majorEastAsia" w:hAnsi="Times New Roman" w:cs="Times New Roman"/>
-          <w:color w:val="000000" w:themeColor="text1"/>
-          <w:sz w:val="24"/>
-          <w:szCs w:val="24"/>
-          <w:lang w:val="en-NG"/>
-        </w:rPr>
-        <w:t>analyzed</w:t>
-      </w:r>
-      <w:proofErr w:type="spellEnd"/>
-      <w:r>
-        <w:rPr>
-          <w:rFonts w:ascii="Times New Roman" w:eastAsiaTheme="majorEastAsia" w:hAnsi="Times New Roman" w:cs="Times New Roman"/>
-          <w:color w:val="000000" w:themeColor="text1"/>
-          <w:sz w:val="24"/>
-          <w:szCs w:val="24"/>
-          <w:lang w:val="en-NG"/>
-        </w:rPr>
-        <w:t xml:space="preserve"> data </w:t>
-      </w:r>
-      <w:r>
-        <w:rPr>
-          <w:rFonts w:ascii="Times New Roman" w:eastAsiaTheme="majorEastAsia" w:hAnsi="Times New Roman" w:cs="Times New Roman"/>
-          <w:color w:val="000000" w:themeColor="text1"/>
-          <w:sz w:val="24"/>
-          <w:szCs w:val="24"/>
-          <w:lang w:val="en-NG"/>
-        </w:rPr>
         <w:lastRenderedPageBreak/>
-        <w:t xml:space="preserve">consists of historical third-party smart-device records rather than </w:t>
-      </w:r>
-      <w:proofErr w:type="spellStart"/>
-      <w:r>
-        <w:rPr>
-          <w:rFonts w:ascii="Times New Roman" w:eastAsiaTheme="majorEastAsia" w:hAnsi="Times New Roman" w:cs="Times New Roman"/>
-          <w:color w:val="000000" w:themeColor="text1"/>
-          <w:sz w:val="24"/>
-          <w:szCs w:val="24"/>
-          <w:lang w:val="en-NG"/>
-        </w:rPr>
-        <w:t>Bellabeat</w:t>
-      </w:r>
-      <w:proofErr w:type="spellEnd"/>
-      <w:r>
-        <w:rPr>
-          <w:rFonts w:ascii="Times New Roman" w:eastAsiaTheme="majorEastAsia" w:hAnsi="Times New Roman" w:cs="Times New Roman"/>
-          <w:color w:val="000000" w:themeColor="text1"/>
-          <w:sz w:val="24"/>
-          <w:szCs w:val="24"/>
-          <w:lang w:val="en-NG"/>
-        </w:rPr>
-        <w:t xml:space="preserve"> customer data, these strategies should be validated through </w:t>
-      </w:r>
-      <w:proofErr w:type="spellStart"/>
-      <w:r>
-        <w:rPr>
-          <w:rFonts w:ascii="Times New Roman" w:eastAsiaTheme="majorEastAsia" w:hAnsi="Times New Roman" w:cs="Times New Roman"/>
-          <w:color w:val="000000" w:themeColor="text1"/>
-          <w:sz w:val="24"/>
-          <w:szCs w:val="24"/>
-          <w:lang w:val="en-NG"/>
-        </w:rPr>
-        <w:t>Bellabeat</w:t>
-      </w:r>
-      <w:proofErr w:type="spellEnd"/>
-      <w:r>
-        <w:rPr>
-          <w:rFonts w:ascii="Times New Roman" w:eastAsiaTheme="majorEastAsia" w:hAnsi="Times New Roman" w:cs="Times New Roman"/>
-          <w:color w:val="000000" w:themeColor="text1"/>
-          <w:sz w:val="24"/>
-          <w:szCs w:val="24"/>
-          <w:lang w:val="en-NG"/>
-        </w:rPr>
-        <w:t>-specific customer analysis and campaign testing before broader implementation.</w:t>
+        <w:t>consists of historical third-party smart-device records rather than Bellabeat customer data, these strategies should be validated through Bellabeat-specific customer analysis and campaign testing before broader implementation.</w:t>
       </w:r>
     </w:p>
     <w:p>
@@ -4019,27 +3185,7 @@
           <w:szCs w:val="24"/>
           <w:lang w:val="en-NG"/>
         </w:rPr>
-        <w:t xml:space="preserve">The SHARE phase focused on transforming the validated analytical results into an interactive Power BI dashboard designed to communicate the most relevant smart-device usage patterns clearly and support the original </w:t>
-      </w:r>
-      <w:proofErr w:type="spellStart"/>
-      <w:r>
-        <w:rPr>
-          <w:rFonts w:ascii="Times New Roman" w:eastAsiaTheme="majorEastAsia" w:hAnsi="Times New Roman" w:cs="Times New Roman"/>
-          <w:sz w:val="24"/>
-          <w:szCs w:val="24"/>
-          <w:lang w:val="en-NG"/>
-        </w:rPr>
-        <w:t>Bellabeat</w:t>
-      </w:r>
-      <w:proofErr w:type="spellEnd"/>
-      <w:r>
-        <w:rPr>
-          <w:rFonts w:ascii="Times New Roman" w:eastAsiaTheme="majorEastAsia" w:hAnsi="Times New Roman" w:cs="Times New Roman"/>
-          <w:sz w:val="24"/>
-          <w:szCs w:val="24"/>
-          <w:lang w:val="en-NG"/>
-        </w:rPr>
-        <w:t xml:space="preserve"> business questions.</w:t>
+        <w:t>The SHARE phase focused on transforming the validated analytical results into an interactive Power BI dashboard designed to communicate the most relevant smart-device usage patterns clearly and support the original Bellabeat business questions.</w:t>
       </w:r>
       <w:r>
         <w:rPr>
@@ -4110,47 +3256,7 @@
           <w:szCs w:val="24"/>
           <w:lang w:val="en-NG"/>
         </w:rPr>
-        <w:t xml:space="preserve">The previously validated hourly steps, intensity, and calorie data were consolidated into a single hourly analytical table because the datasets had been confirmed to align at the user and hourly timestamp level. This provided a simplified structure for </w:t>
-      </w:r>
-      <w:proofErr w:type="spellStart"/>
-      <w:r>
-        <w:rPr>
-          <w:rFonts w:ascii="Times New Roman" w:eastAsiaTheme="majorEastAsia" w:hAnsi="Times New Roman" w:cs="Times New Roman"/>
-          <w:sz w:val="24"/>
-          <w:szCs w:val="24"/>
-          <w:lang w:val="en-NG"/>
-        </w:rPr>
-        <w:t>analyzing</w:t>
-      </w:r>
-      <w:proofErr w:type="spellEnd"/>
-      <w:r>
-        <w:rPr>
-          <w:rFonts w:ascii="Times New Roman" w:eastAsiaTheme="majorEastAsia" w:hAnsi="Times New Roman" w:cs="Times New Roman"/>
-          <w:sz w:val="24"/>
-          <w:szCs w:val="24"/>
-          <w:lang w:val="en-NG"/>
-        </w:rPr>
-        <w:t xml:space="preserve"> time-of-day </w:t>
-      </w:r>
-      <w:proofErr w:type="spellStart"/>
-      <w:r>
-        <w:rPr>
-          <w:rFonts w:ascii="Times New Roman" w:eastAsiaTheme="majorEastAsia" w:hAnsi="Times New Roman" w:cs="Times New Roman"/>
-          <w:sz w:val="24"/>
-          <w:szCs w:val="24"/>
-          <w:lang w:val="en-NG"/>
-        </w:rPr>
-        <w:t>behavior</w:t>
-      </w:r>
-      <w:proofErr w:type="spellEnd"/>
-      <w:r>
-        <w:rPr>
-          <w:rFonts w:ascii="Times New Roman" w:eastAsiaTheme="majorEastAsia" w:hAnsi="Times New Roman" w:cs="Times New Roman"/>
-          <w:sz w:val="24"/>
-          <w:szCs w:val="24"/>
-          <w:lang w:val="en-NG"/>
-        </w:rPr>
-        <w:t>.</w:t>
+        <w:t>The previously validated hourly steps, intensity, and calorie data were consolidated into a single hourly analytical table because the datasets had been confirmed to align at the user and hourly timestamp level. This provided a simplified structure for analyzing time-of-day behavior.</w:t>
       </w:r>
     </w:p>
     <w:p>
@@ -4336,27 +3442,7 @@
           <w:szCs w:val="24"/>
           <w:lang w:val="en-NG"/>
         </w:rPr>
-        <w:t xml:space="preserve">Average Daily Minutes by Activity Level compares sedentary, lightly active, </w:t>
-      </w:r>
-      <w:proofErr w:type="gramStart"/>
-      <w:r>
-        <w:rPr>
-          <w:rFonts w:ascii="Times New Roman" w:eastAsiaTheme="majorEastAsia" w:hAnsi="Times New Roman" w:cs="Times New Roman"/>
-          <w:sz w:val="24"/>
-          <w:szCs w:val="24"/>
-          <w:lang w:val="en-NG"/>
-        </w:rPr>
-        <w:t>fairly active</w:t>
-      </w:r>
-      <w:proofErr w:type="gramEnd"/>
-      <w:r>
-        <w:rPr>
-          <w:rFonts w:ascii="Times New Roman" w:eastAsiaTheme="majorEastAsia" w:hAnsi="Times New Roman" w:cs="Times New Roman"/>
-          <w:sz w:val="24"/>
-          <w:szCs w:val="24"/>
-          <w:lang w:val="en-NG"/>
-        </w:rPr>
-        <w:t>, and very active minutes. The visualization demonstrates that recorded daily time was dominated by sedentary and light activity.</w:t>
+        <w:t>Average Daily Minutes by Activity Level compares sedentary, lightly active, fairly active, and very active minutes. The visualization demonstrates that recorded daily time was dominated by sedentary and light activity.</w:t>
       </w:r>
     </w:p>
     <w:p>
@@ -4396,27 +3482,7 @@
           <w:szCs w:val="24"/>
           <w:lang w:val="en-NG"/>
         </w:rPr>
-        <w:t xml:space="preserve">Recorded Activity Days by Participant displays variation in available activity coverage. Participant records ranged from 8 to 32 days, highlighting uneven representation across the observation period rather than confirmed differences in device-wearing </w:t>
-      </w:r>
-      <w:proofErr w:type="spellStart"/>
-      <w:r>
-        <w:rPr>
-          <w:rFonts w:ascii="Times New Roman" w:eastAsiaTheme="majorEastAsia" w:hAnsi="Times New Roman" w:cs="Times New Roman"/>
-          <w:sz w:val="24"/>
-          <w:szCs w:val="24"/>
-          <w:lang w:val="en-NG"/>
-        </w:rPr>
-        <w:t>behavior</w:t>
-      </w:r>
-      <w:proofErr w:type="spellEnd"/>
-      <w:r>
-        <w:rPr>
-          <w:rFonts w:ascii="Times New Roman" w:eastAsiaTheme="majorEastAsia" w:hAnsi="Times New Roman" w:cs="Times New Roman"/>
-          <w:sz w:val="24"/>
-          <w:szCs w:val="24"/>
-          <w:lang w:val="en-NG"/>
-        </w:rPr>
-        <w:t>.</w:t>
+        <w:t>Recorded Activity Days by Participant displays variation in available activity coverage. Participant records ranged from 8 to 32 days, highlighting uneven representation across the observation period rather than confirmed differences in device-wearing behavior.</w:t>
       </w:r>
     </w:p>
     <w:p>
@@ -4480,27 +3546,7 @@
           <w:szCs w:val="24"/>
           <w:lang w:val="en-NG"/>
         </w:rPr>
-        <w:t xml:space="preserve">Participant and date slicers were incorporated to allow users to explore </w:t>
-      </w:r>
-      <w:proofErr w:type="spellStart"/>
-      <w:r>
-        <w:rPr>
-          <w:rFonts w:ascii="Times New Roman" w:eastAsiaTheme="majorEastAsia" w:hAnsi="Times New Roman" w:cs="Times New Roman"/>
-          <w:sz w:val="24"/>
-          <w:szCs w:val="24"/>
-          <w:lang w:val="en-NG"/>
-        </w:rPr>
-        <w:t>behavioral</w:t>
-      </w:r>
-      <w:proofErr w:type="spellEnd"/>
-      <w:r>
-        <w:rPr>
-          <w:rFonts w:ascii="Times New Roman" w:eastAsiaTheme="majorEastAsia" w:hAnsi="Times New Roman" w:cs="Times New Roman"/>
-          <w:sz w:val="24"/>
-          <w:szCs w:val="24"/>
-          <w:lang w:val="en-NG"/>
-        </w:rPr>
-        <w:t xml:space="preserve"> patterns across individuals and time periods.</w:t>
+        <w:t>Participant and date slicers were incorporated to allow users to explore behavioral patterns across individuals and time periods.</w:t>
       </w:r>
     </w:p>
     <w:p>
@@ -4521,27 +3567,7 @@
           <w:szCs w:val="24"/>
           <w:lang w:val="en-NG"/>
         </w:rPr>
-        <w:t xml:space="preserve">Interactions were configured deliberately so that </w:t>
-      </w:r>
-      <w:proofErr w:type="spellStart"/>
-      <w:r>
-        <w:rPr>
-          <w:rFonts w:ascii="Times New Roman" w:eastAsiaTheme="majorEastAsia" w:hAnsi="Times New Roman" w:cs="Times New Roman"/>
-          <w:sz w:val="24"/>
-          <w:szCs w:val="24"/>
-          <w:lang w:val="en-NG"/>
-        </w:rPr>
-        <w:t>behavioral</w:t>
-      </w:r>
-      <w:proofErr w:type="spellEnd"/>
-      <w:r>
-        <w:rPr>
-          <w:rFonts w:ascii="Times New Roman" w:eastAsiaTheme="majorEastAsia" w:hAnsi="Times New Roman" w:cs="Times New Roman"/>
-          <w:sz w:val="24"/>
-          <w:szCs w:val="24"/>
-          <w:lang w:val="en-NG"/>
-        </w:rPr>
-        <w:t xml:space="preserve"> metrics respond to participant selections while the overall participant count remains fixed as dataset context. The participant coverage visualization also retains the broader cross-participant comparison when an individual participant is selected.</w:t>
+        <w:t>Interactions were configured deliberately so that behavioral metrics respond to participant selections while the overall participant count remains fixed as dataset context. The participant coverage visualization also retains the broader cross-participant comparison when an individual participant is selected.</w:t>
       </w:r>
       <w:r>
         <w:rPr>
@@ -4687,33 +3713,7 @@
           <w:szCs w:val="24"/>
           <w:lang w:val="en-NG"/>
         </w:rPr>
-        <w:t xml:space="preserve">The completed dashboard was tested against the previously validated Excel results and checked for expected slicer </w:t>
-      </w:r>
-      <w:proofErr w:type="spellStart"/>
-      <w:r>
-        <w:rPr>
-          <w:rFonts w:ascii="Times New Roman" w:hAnsi="Times New Roman" w:cs="Times New Roman"/>
-          <w:b w:val="0"/>
-          <w:bCs w:val="0"/>
-          <w:color w:val="auto"/>
-          <w:sz w:val="24"/>
-          <w:szCs w:val="24"/>
-          <w:lang w:val="en-NG"/>
-        </w:rPr>
-        <w:t>behavior</w:t>
-      </w:r>
-      <w:proofErr w:type="spellEnd"/>
-      <w:r>
-        <w:rPr>
-          <w:rFonts w:ascii="Times New Roman" w:hAnsi="Times New Roman" w:cs="Times New Roman"/>
-          <w:b w:val="0"/>
-          <w:bCs w:val="0"/>
-          <w:color w:val="auto"/>
-          <w:sz w:val="24"/>
-          <w:szCs w:val="24"/>
-          <w:lang w:val="en-NG"/>
-        </w:rPr>
-        <w:t>, calculation consistency, visual accuracy, and appropriate interpretation.</w:t>
+        <w:t>The completed dashboard was tested against the previously validated Excel results and checked for expected slicer behavior, calculation consistency, visual accuracy, and appropriate interpretation.</w:t>
       </w:r>
     </w:p>
     <w:p>
@@ -4772,33 +3772,7 @@
           <w:szCs w:val="24"/>
           <w:lang w:val="en-NG"/>
         </w:rPr>
-        <w:t xml:space="preserve">Based on the observed smart-device usage patterns, </w:t>
-      </w:r>
-      <w:proofErr w:type="spellStart"/>
-      <w:r>
-        <w:rPr>
-          <w:rFonts w:ascii="Times New Roman" w:hAnsi="Times New Roman" w:cs="Times New Roman"/>
-          <w:b w:val="0"/>
-          <w:bCs w:val="0"/>
-          <w:color w:val="000000" w:themeColor="text1"/>
-          <w:sz w:val="24"/>
-          <w:szCs w:val="24"/>
-          <w:lang w:val="en-NG"/>
-        </w:rPr>
-        <w:t>Bellabeat</w:t>
-      </w:r>
-      <w:proofErr w:type="spellEnd"/>
-      <w:r>
-        <w:rPr>
-          <w:rFonts w:ascii="Times New Roman" w:hAnsi="Times New Roman" w:cs="Times New Roman"/>
-          <w:b w:val="0"/>
-          <w:bCs w:val="0"/>
-          <w:color w:val="000000" w:themeColor="text1"/>
-          <w:sz w:val="24"/>
-          <w:szCs w:val="24"/>
-          <w:lang w:val="en-NG"/>
-        </w:rPr>
-        <w:t xml:space="preserve"> could consider three primary strategic opportunities.</w:t>
+        <w:t>Based on the observed smart-device usage patterns, Bellabeat could consider three primary strategic opportunities.</w:t>
       </w:r>
     </w:p>
     <w:p>
@@ -4899,33 +3873,7 @@
           <w:lang w:val="en-NG"/>
         </w:rPr>
         <w:lastRenderedPageBreak/>
-        <w:t xml:space="preserve">These recommendations should be validated using </w:t>
-      </w:r>
-      <w:proofErr w:type="spellStart"/>
-      <w:r>
-        <w:rPr>
-          <w:rFonts w:ascii="Times New Roman" w:hAnsi="Times New Roman" w:cs="Times New Roman"/>
-          <w:b w:val="0"/>
-          <w:bCs w:val="0"/>
-          <w:color w:val="000000" w:themeColor="text1"/>
-          <w:sz w:val="24"/>
-          <w:szCs w:val="24"/>
-          <w:lang w:val="en-NG"/>
-        </w:rPr>
-        <w:t>Bellabeat</w:t>
-      </w:r>
-      <w:proofErr w:type="spellEnd"/>
-      <w:r>
-        <w:rPr>
-          <w:rFonts w:ascii="Times New Roman" w:hAnsi="Times New Roman" w:cs="Times New Roman"/>
-          <w:b w:val="0"/>
-          <w:bCs w:val="0"/>
-          <w:color w:val="000000" w:themeColor="text1"/>
-          <w:sz w:val="24"/>
-          <w:szCs w:val="24"/>
-          <w:lang w:val="en-NG"/>
-        </w:rPr>
-        <w:t>-specific customer and engagement data. Controlled testing should be used to determine whether the identified opportunities produce meaningful improvements before broader implementation.</w:t>
+        <w:t>These recommendations should be validated using Bellabeat-specific customer and engagement data. Controlled testing should be used to determine whether the identified opportunities produce meaningful improvements before broader implementation.</w:t>
       </w:r>
     </w:p>
     <w:p>
@@ -5058,19 +4006,11 @@
       <w:pStyle w:val="Footer"/>
       <w:jc w:val="center"/>
     </w:pPr>
-    <w:proofErr w:type="spellStart"/>
     <w:r>
       <w:rPr>
         <w:sz w:val="16"/>
       </w:rPr>
-      <w:t>Bellabeat</w:t>
-    </w:r>
-    <w:proofErr w:type="spellEnd"/>
-    <w:r>
-      <w:rPr>
-        <w:sz w:val="16"/>
-      </w:rPr>
-      <w:t xml:space="preserve"> Smart-Device Usage Case Study</w:t>
+      <w:t>Bellabeat Smart-Device Usage Case Study</w:t>
     </w:r>
   </w:p>
 </w:ftr>

</xml_diff>